<commit_message>
content: add ASML Senior Linux Administrator (2009-2011) under TCS in master resume
Co-Authored-By: Claude Opus 4.8 <noreply@anthropic.com>
</commit_message>
<xml_diff>
--- a/assets/resume/Sudhakar_Chundu_Master_Resume.docx
+++ b/assets/resume/Sudhakar_Chundu_Master_Resume.docx
@@ -1274,7 +1274,7 @@
           <w:color w:val="555555"/>
           <w:sz w:val="19"/>
         </w:rPr>
-        <w:t>Tata Consultancy Services — CNA, PwC, Verizon, Owens Corning  |  India &amp; USA</w:t>
+        <w:t>Tata Consultancy Services — CNA, PwC, Verizon, Owens Corning, ASML  |  India &amp; USA</w:t>
       </w:r>
     </w:p>
     <w:p>
@@ -1302,6 +1302,33 @@
           <w:sz w:val="20"/>
         </w:rPr>
         <w:t>11-year career across Fortune 500 clients: Linux/Unix administration → cloud architecture → infrastructure leadership, including 12+ facility buildouts (branch offices, call centers, data centers).</w:t>
+      </w:r>
+    </w:p>
+    <w:p>
+      <w:pPr>
+        <w:pStyle w:val="ListBullet"/>
+        <w:spacing w:after="30" w:line="247" w:lineRule="auto"/>
+        <w:ind w:left="288"/>
+      </w:pPr>
+      <w:r>
+        <w:rPr>
+          <w:rFonts w:ascii="Calibri" w:hAnsi="Calibri"/>
+          <w:b/>
+          <w:i w:val="0"/>
+          <w:color w:val="1A1A1A"/>
+          <w:sz w:val="20"/>
+        </w:rPr>
+        <w:t xml:space="preserve">Served as </w:t>
+      </w:r>
+      <w:r>
+        <w:rPr>
+          <w:rFonts w:ascii="Calibri" w:hAnsi="Calibri"/>
+          <w:b w:val="0"/>
+          <w:i w:val="0"/>
+          <w:color w:val="1A1A1A"/>
+          <w:sz w:val="20"/>
+        </w:rPr>
+        <w:t>Senior Linux Administrator, ASML (2009–2011) — administered large-scale RHEL/Linux server fleets for mission-critical semiconductor engineering environments; automated provisioning, patching, and monitoring; tuned kernel and storage for high-availability compute workloads with 24x7 on-call support.</w:t>
       </w:r>
     </w:p>
     <w:p>

</xml_diff>

<commit_message>
content: add PwC middleware DevOps (WebSphere/WebLogic on Azure/AWS) bullet under TCS
Co-Authored-By: Claude Opus 4.8 <noreply@anthropic.com>
</commit_message>
<xml_diff>
--- a/assets/resume/Sudhakar_Chundu_Master_Resume.docx
+++ b/assets/resume/Sudhakar_Chundu_Master_Resume.docx
@@ -1345,6 +1345,33 @@
           <w:color w:val="1A1A1A"/>
           <w:sz w:val="20"/>
         </w:rPr>
+        <w:t xml:space="preserve">Delivered </w:t>
+      </w:r>
+      <w:r>
+        <w:rPr>
+          <w:rFonts w:ascii="Calibri" w:hAnsi="Calibri"/>
+          <w:b w:val="0"/>
+          <w:i w:val="0"/>
+          <w:color w:val="1A1A1A"/>
+          <w:sz w:val="20"/>
+        </w:rPr>
+        <w:t>Middleware DevOps for PwC — WebSphere and WebLogic administration, automation, and deployment pipelines on Azure and AWS; managed application-server clustering, JVM tuning, and zero-downtime middleware releases.</w:t>
+      </w:r>
+    </w:p>
+    <w:p>
+      <w:pPr>
+        <w:pStyle w:val="ListBullet"/>
+        <w:spacing w:after="30" w:line="247" w:lineRule="auto"/>
+        <w:ind w:left="288"/>
+      </w:pPr>
+      <w:r>
+        <w:rPr>
+          <w:rFonts w:ascii="Calibri" w:hAnsi="Calibri"/>
+          <w:b/>
+          <w:i w:val="0"/>
+          <w:color w:val="1A1A1A"/>
+          <w:sz w:val="20"/>
+        </w:rPr>
         <w:t xml:space="preserve">Led </w:t>
       </w:r>
       <w:r>
@@ -1355,7 +1382,7 @@
           <w:color w:val="1A1A1A"/>
           <w:sz w:val="20"/>
         </w:rPr>
-        <w:t>cloud migrations to AWS, Azure, and OpenStack; pioneered Docker/Kubernetes adoption (2013–14); implemented CI/CD with Jenkins, Ansible, and Terraform; deep Linux administration with WebSphere/WebLogic middleware, JVM tuning, and 24x7 on-call.</w:t>
+        <w:t>cloud migrations to AWS, Azure, and OpenStack; pioneered Docker/Kubernetes adoption (2013–14); implemented CI/CD with Jenkins, Ansible, and Terraform; deep Linux administration and middleware operations across enterprise workloads with 24x7 on-call.</w:t>
       </w:r>
     </w:p>
     <w:p>

</xml_diff>